<commit_message>
refactor: remove manuscript_supplement.rmarkdown and update supporting manuscript document files
</commit_message>
<xml_diff>
--- a/manuscripts/custom-reference.docx
+++ b/manuscripts/custom-reference.docx
@@ -328,7 +328,7 @@
           <w:bottom w:w="0" w:type="dxa"/>
           <w:right w:w="108" w:type="dxa"/>
         </w:tblCellMar>
-        <w:tblLook w:firstRow="1"/>
+        <w:tblLook w:firstRow="1" w:val="07e0"/>
       </w:tblPr>
       <w:tblGrid>
         <w:gridCol w:w="4679"/>
@@ -351,6 +351,7 @@
             <w:pPr>
               <w:pStyle w:val="Compact"/>
               <w:widowControl/>
+              <w:suppressAutoHyphens w:val="true"/>
               <w:spacing w:before="36" w:after="36"/>
               <w:jc w:val="left"/>
               <w:rPr>
@@ -383,6 +384,7 @@
             <w:pPr>
               <w:pStyle w:val="Compact"/>
               <w:widowControl/>
+              <w:suppressAutoHyphens w:val="true"/>
               <w:spacing w:before="36" w:after="36"/>
               <w:jc w:val="left"/>
               <w:rPr>
@@ -415,6 +417,7 @@
             <w:pPr>
               <w:pStyle w:val="Compact"/>
               <w:widowControl/>
+              <w:suppressAutoHyphens w:val="true"/>
               <w:spacing w:before="36" w:after="36"/>
               <w:jc w:val="left"/>
               <w:rPr>
@@ -444,6 +447,7 @@
             <w:pPr>
               <w:pStyle w:val="Compact"/>
               <w:widowControl/>
+              <w:suppressAutoHyphens w:val="true"/>
               <w:spacing w:before="36" w:after="36"/>
               <w:jc w:val="left"/>
               <w:rPr>
@@ -635,6 +639,7 @@
     <w:qFormat/>
     <w:pPr>
       <w:widowControl/>
+      <w:suppressAutoHyphens w:val="true"/>
       <w:bidi w:val="0"/>
       <w:spacing w:before="0" w:after="200"/>
       <w:jc w:val="left"/>
@@ -1042,9 +1047,16 @@
     <w:qFormat/>
     <w:rPr/>
   </w:style>
+  <w:style w:type="character" w:styleId="FootnoteCharactersuser">
+    <w:name w:val="Footnote Characters (user)"/>
+    <w:basedOn w:val="BodyTextChar"/>
+    <w:qFormat/>
+    <w:rPr>
+      <w:vertAlign w:val="superscript"/>
+    </w:rPr>
+  </w:style>
   <w:style w:type="character" w:styleId="FootnoteCharacters">
     <w:name w:val="Footnote Characters"/>
-    <w:basedOn w:val="BodyTextChar"/>
     <w:qFormat/>
     <w:rPr>
       <w:vertAlign w:val="superscript"/>
@@ -1144,14 +1156,21 @@
       <w:szCs w:val="20"/>
     </w:rPr>
   </w:style>
+  <w:style w:type="character" w:styleId="EndnoteCharacters">
+    <w:name w:val="Endnote Characters"/>
+    <w:qFormat/>
+    <w:rPr>
+      <w:vertAlign w:val="superscript"/>
+    </w:rPr>
+  </w:style>
   <w:style w:type="character" w:styleId="EndnoteReference">
     <w:name w:val="endnote reference"/>
     <w:rPr>
       <w:vertAlign w:val="superscript"/>
     </w:rPr>
   </w:style>
-  <w:style w:type="character" w:styleId="EndnoteCharacters">
-    <w:name w:val="Endnote Characters"/>
+  <w:style w:type="character" w:styleId="EndnoteCharactersuser">
+    <w:name w:val="Endnote Characters (user)"/>
     <w:qFormat/>
     <w:rPr/>
   </w:style>
@@ -1176,7 +1195,7 @@
     <w:link w:val="BodyTextChar"/>
     <w:qFormat/>
     <w:pPr>
-      <w:spacing w:lineRule="auto" w:line="480" w:before="180" w:after="180"/>
+      <w:spacing w:lineRule="auto" w:line="480" w:before="0" w:after="590"/>
     </w:pPr>
     <w:rPr/>
   </w:style>
@@ -1675,6 +1694,7 @@
     <w:rsid w:val="23217492"/>
     <w:pPr>
       <w:widowControl/>
+      <w:suppressAutoHyphens w:val="true"/>
       <w:bidi w:val="0"/>
       <w:spacing w:before="0" w:after="0"/>
       <w:jc w:val="left"/>

</xml_diff>